<commit_message>
Proctor Guide: four sections (calculator, timeline, reads/hand-outs, Colonel pushback); worksheet cleanup
Co-Authored-By: Claude Opus 5.5 <noreply@anthropic.com>
Claude-Session: https://claude.ai/code/session_01JsXR6TGhWtuxw66gtWpfpZ
</commit_message>
<xml_diff>
--- a/guides/Island_Spoke_GMC_Daily_Worksheets.docx
+++ b/guides/Island_Spoke_GMC_Daily_Worksheets.docx
@@ -86,7 +86,7 @@
                 <w:sz w:val="20"/>
                 <w:szCs w:val="20"/>
               </w:rPr>
-              <w:t xml:space="preserve">Operation Island Spoke  |  Keep this sheet with the wing</w:t>
+              <w:t xml:space="preserve">Operation Island Spoke</w:t>
             </w:r>
           </w:p>
         </w:tc>
@@ -111,6 +111,14 @@
           <w:szCs w:val="24"/>
         </w:rPr>
         <w:t xml:space="preserve">1. Availability Board</w:t>
+      </w:r>
+      <w:r>
+        <w:rPr>
+          <w:rFonts w:ascii="Arial" w:cs="Arial" w:eastAsia="Arial" w:hAnsi="Arial"/>
+          <w:sz w:val="22"/>
+          <w:szCs w:val="22"/>
+        </w:rPr>
+        <w:t xml:space="preserve"/>
       </w:r>
     </w:p>
     <w:tbl>
@@ -2656,127 +2664,6 @@
                 <w:szCs w:val="20"/>
               </w:rPr>
               <w:t xml:space="preserve">Total</w:t>
-            </w:r>
-          </w:p>
-          <w:p>
-            <w:pPr>
-              <w:spacing w:after="40" w:before="0"/>
-            </w:pPr>
-            <w:r>
-              <w:rPr>
-                <w:rFonts w:ascii="Arial" w:cs="Arial" w:eastAsia="Arial" w:hAnsi="Arial"/>
-                <w:sz w:val="20"/>
-                <w:szCs w:val="20"/>
-              </w:rPr>
-              <w:t xml:space="preserve"/>
-            </w:r>
-          </w:p>
-          <w:p>
-            <w:pPr>
-              <w:spacing w:after="40" w:before="0"/>
-            </w:pPr>
-            <w:r>
-              <w:rPr>
-                <w:rFonts w:ascii="Arial" w:cs="Arial" w:eastAsia="Arial" w:hAnsi="Arial"/>
-                <w:sz w:val="20"/>
-                <w:szCs w:val="20"/>
-              </w:rPr>
-              <w:t xml:space="preserve">______</w:t>
-            </w:r>
-          </w:p>
-        </w:tc>
-      </w:tr>
-      <w:tr>
-        <w:tc>
-          <w:tcPr>
-            <w:tcW w:type="dxa" w:w="6240"/>
-            <w:gridSpan w:val="2"/>
-            <w:tcBorders>
-              <w:top w:val="single" w:color="A6C3DC" w:sz="4"/>
-              <w:left w:val="single" w:color="A6C3DC" w:sz="4"/>
-              <w:bottom w:val="single" w:color="A6C3DC" w:sz="4"/>
-              <w:right w:val="single" w:color="A6C3DC" w:sz="4"/>
-            </w:tcBorders>
-            <w:tcMar>
-              <w:top w:type="dxa" w:w="90"/>
-              <w:left w:type="dxa" w:w="140"/>
-              <w:bottom w:type="dxa" w:w="90"/>
-              <w:right w:type="dxa" w:w="140"/>
-            </w:tcMar>
-            <w:vAlign w:val="top"/>
-          </w:tcPr>
-          <w:p>
-            <w:pPr>
-              <w:spacing w:after="40" w:before="0"/>
-            </w:pPr>
-            <w:r>
-              <w:rPr>
-                <w:rFonts w:ascii="Arial" w:cs="Arial" w:eastAsia="Arial" w:hAnsi="Arial"/>
-                <w:b/>
-                <w:bCs/>
-                <w:sz w:val="20"/>
-                <w:szCs w:val="20"/>
-              </w:rPr>
-              <w:t xml:space="preserve">Shift posture</w:t>
-            </w:r>
-          </w:p>
-          <w:p>
-            <w:pPr>
-              <w:spacing w:after="40" w:before="0"/>
-            </w:pPr>
-            <w:r>
-              <w:rPr>
-                <w:rFonts w:ascii="Arial" w:cs="Arial" w:eastAsia="Arial" w:hAnsi="Arial"/>
-                <w:sz w:val="20"/>
-                <w:szCs w:val="20"/>
-              </w:rPr>
-              <w:t xml:space="preserve"/>
-            </w:r>
-          </w:p>
-          <w:p>
-            <w:pPr>
-              <w:spacing w:after="40" w:before="0"/>
-            </w:pPr>
-            <w:r>
-              <w:rPr>
-                <w:rFonts w:ascii="Arial" w:cs="Arial" w:eastAsia="Arial" w:hAnsi="Arial"/>
-                <w:sz w:val="20"/>
-                <w:szCs w:val="20"/>
-              </w:rPr>
-              <w:t xml:space="preserve">______________________</w:t>
-            </w:r>
-          </w:p>
-        </w:tc>
-        <w:tc>
-          <w:tcPr>
-            <w:tcW w:type="dxa" w:w="3120"/>
-            <w:tcBorders>
-              <w:top w:val="single" w:color="A6C3DC" w:sz="4"/>
-              <w:left w:val="single" w:color="A6C3DC" w:sz="4"/>
-              <w:bottom w:val="single" w:color="A6C3DC" w:sz="4"/>
-              <w:right w:val="single" w:color="A6C3DC" w:sz="4"/>
-            </w:tcBorders>
-            <w:tcMar>
-              <w:top w:type="dxa" w:w="90"/>
-              <w:left w:type="dxa" w:w="140"/>
-              <w:bottom w:type="dxa" w:w="90"/>
-              <w:right w:type="dxa" w:w="140"/>
-            </w:tcMar>
-            <w:vAlign w:val="top"/>
-          </w:tcPr>
-          <w:p>
-            <w:pPr>
-              <w:spacing w:after="40" w:before="0"/>
-            </w:pPr>
-            <w:r>
-              <w:rPr>
-                <w:rFonts w:ascii="Arial" w:cs="Arial" w:eastAsia="Arial" w:hAnsi="Arial"/>
-                <w:b/>
-                <w:bCs/>
-                <w:sz w:val="20"/>
-                <w:szCs w:val="20"/>
-              </w:rPr>
-              <w:t xml:space="preserve">Wing CC initials</w:t>
             </w:r>
           </w:p>
           <w:p>
@@ -3014,7 +2901,7 @@
                 <w:sz w:val="20"/>
                 <w:szCs w:val="20"/>
               </w:rPr>
-              <w:t xml:space="preserve">Operation Island Spoke  |  Keep this sheet with the wing</w:t>
+              <w:t xml:space="preserve">Operation Island Spoke</w:t>
             </w:r>
           </w:p>
         </w:tc>
@@ -3039,6 +2926,15 @@
           <w:szCs w:val="24"/>
         </w:rPr>
         <w:t xml:space="preserve">1. Availability Board</w:t>
+      </w:r>
+      <w:r>
+        <w:rPr>
+          <w:rFonts w:ascii="Arial" w:cs="Arial" w:eastAsia="Arial" w:hAnsi="Arial"/>
+          <w:color w:val="666666"/>
+          <w:sz w:val="18"/>
+          <w:szCs w:val="18"/>
+        </w:rPr>
+        <w:t xml:space="preserve">   Fill Ready, Down, and Out from the last readout</w:t>
       </w:r>
     </w:p>
     <w:tbl>
@@ -5584,127 +5480,6 @@
                 <w:szCs w:val="20"/>
               </w:rPr>
               <w:t xml:space="preserve">Total</w:t>
-            </w:r>
-          </w:p>
-          <w:p>
-            <w:pPr>
-              <w:spacing w:after="40" w:before="0"/>
-            </w:pPr>
-            <w:r>
-              <w:rPr>
-                <w:rFonts w:ascii="Arial" w:cs="Arial" w:eastAsia="Arial" w:hAnsi="Arial"/>
-                <w:sz w:val="20"/>
-                <w:szCs w:val="20"/>
-              </w:rPr>
-              <w:t xml:space="preserve"/>
-            </w:r>
-          </w:p>
-          <w:p>
-            <w:pPr>
-              <w:spacing w:after="40" w:before="0"/>
-            </w:pPr>
-            <w:r>
-              <w:rPr>
-                <w:rFonts w:ascii="Arial" w:cs="Arial" w:eastAsia="Arial" w:hAnsi="Arial"/>
-                <w:sz w:val="20"/>
-                <w:szCs w:val="20"/>
-              </w:rPr>
-              <w:t xml:space="preserve">______</w:t>
-            </w:r>
-          </w:p>
-        </w:tc>
-      </w:tr>
-      <w:tr>
-        <w:tc>
-          <w:tcPr>
-            <w:tcW w:type="dxa" w:w="6240"/>
-            <w:gridSpan w:val="2"/>
-            <w:tcBorders>
-              <w:top w:val="single" w:color="A6C3DC" w:sz="4"/>
-              <w:left w:val="single" w:color="A6C3DC" w:sz="4"/>
-              <w:bottom w:val="single" w:color="A6C3DC" w:sz="4"/>
-              <w:right w:val="single" w:color="A6C3DC" w:sz="4"/>
-            </w:tcBorders>
-            <w:tcMar>
-              <w:top w:type="dxa" w:w="90"/>
-              <w:left w:type="dxa" w:w="140"/>
-              <w:bottom w:type="dxa" w:w="90"/>
-              <w:right w:type="dxa" w:w="140"/>
-            </w:tcMar>
-            <w:vAlign w:val="top"/>
-          </w:tcPr>
-          <w:p>
-            <w:pPr>
-              <w:spacing w:after="40" w:before="0"/>
-            </w:pPr>
-            <w:r>
-              <w:rPr>
-                <w:rFonts w:ascii="Arial" w:cs="Arial" w:eastAsia="Arial" w:hAnsi="Arial"/>
-                <w:b/>
-                <w:bCs/>
-                <w:sz w:val="20"/>
-                <w:szCs w:val="20"/>
-              </w:rPr>
-              <w:t xml:space="preserve">Shift posture</w:t>
-            </w:r>
-          </w:p>
-          <w:p>
-            <w:pPr>
-              <w:spacing w:after="40" w:before="0"/>
-            </w:pPr>
-            <w:r>
-              <w:rPr>
-                <w:rFonts w:ascii="Arial" w:cs="Arial" w:eastAsia="Arial" w:hAnsi="Arial"/>
-                <w:sz w:val="20"/>
-                <w:szCs w:val="20"/>
-              </w:rPr>
-              <w:t xml:space="preserve"/>
-            </w:r>
-          </w:p>
-          <w:p>
-            <w:pPr>
-              <w:spacing w:after="40" w:before="0"/>
-            </w:pPr>
-            <w:r>
-              <w:rPr>
-                <w:rFonts w:ascii="Arial" w:cs="Arial" w:eastAsia="Arial" w:hAnsi="Arial"/>
-                <w:sz w:val="20"/>
-                <w:szCs w:val="20"/>
-              </w:rPr>
-              <w:t xml:space="preserve">______________________</w:t>
-            </w:r>
-          </w:p>
-        </w:tc>
-        <w:tc>
-          <w:tcPr>
-            <w:tcW w:type="dxa" w:w="3120"/>
-            <w:tcBorders>
-              <w:top w:val="single" w:color="A6C3DC" w:sz="4"/>
-              <w:left w:val="single" w:color="A6C3DC" w:sz="4"/>
-              <w:bottom w:val="single" w:color="A6C3DC" w:sz="4"/>
-              <w:right w:val="single" w:color="A6C3DC" w:sz="4"/>
-            </w:tcBorders>
-            <w:tcMar>
-              <w:top w:type="dxa" w:w="90"/>
-              <w:left w:type="dxa" w:w="140"/>
-              <w:bottom w:type="dxa" w:w="90"/>
-              <w:right w:type="dxa" w:w="140"/>
-            </w:tcMar>
-            <w:vAlign w:val="top"/>
-          </w:tcPr>
-          <w:p>
-            <w:pPr>
-              <w:spacing w:after="40" w:before="0"/>
-            </w:pPr>
-            <w:r>
-              <w:rPr>
-                <w:rFonts w:ascii="Arial" w:cs="Arial" w:eastAsia="Arial" w:hAnsi="Arial"/>
-                <w:b/>
-                <w:bCs/>
-                <w:sz w:val="20"/>
-                <w:szCs w:val="20"/>
-              </w:rPr>
-              <w:t xml:space="preserve">Wing CC initials</w:t>
             </w:r>
           </w:p>
           <w:p>
@@ -5942,7 +5717,7 @@
                 <w:sz w:val="20"/>
                 <w:szCs w:val="20"/>
               </w:rPr>
-              <w:t xml:space="preserve">Operation Island Spoke  |  Keep this sheet with the wing</w:t>
+              <w:t xml:space="preserve">Operation Island Spoke</w:t>
             </w:r>
           </w:p>
         </w:tc>
@@ -5967,6 +5742,15 @@
           <w:szCs w:val="24"/>
         </w:rPr>
         <w:t xml:space="preserve">1. Availability Board</w:t>
+      </w:r>
+      <w:r>
+        <w:rPr>
+          <w:rFonts w:ascii="Arial" w:cs="Arial" w:eastAsia="Arial" w:hAnsi="Arial"/>
+          <w:color w:val="666666"/>
+          <w:sz w:val="18"/>
+          <w:szCs w:val="18"/>
+        </w:rPr>
+        <w:t xml:space="preserve">   Fill Ready, Down, and Out from the last readout</w:t>
       </w:r>
     </w:p>
     <w:tbl>
@@ -8512,127 +8296,6 @@
                 <w:szCs w:val="20"/>
               </w:rPr>
               <w:t xml:space="preserve">Total</w:t>
-            </w:r>
-          </w:p>
-          <w:p>
-            <w:pPr>
-              <w:spacing w:after="40" w:before="0"/>
-            </w:pPr>
-            <w:r>
-              <w:rPr>
-                <w:rFonts w:ascii="Arial" w:cs="Arial" w:eastAsia="Arial" w:hAnsi="Arial"/>
-                <w:sz w:val="20"/>
-                <w:szCs w:val="20"/>
-              </w:rPr>
-              <w:t xml:space="preserve"/>
-            </w:r>
-          </w:p>
-          <w:p>
-            <w:pPr>
-              <w:spacing w:after="40" w:before="0"/>
-            </w:pPr>
-            <w:r>
-              <w:rPr>
-                <w:rFonts w:ascii="Arial" w:cs="Arial" w:eastAsia="Arial" w:hAnsi="Arial"/>
-                <w:sz w:val="20"/>
-                <w:szCs w:val="20"/>
-              </w:rPr>
-              <w:t xml:space="preserve">______</w:t>
-            </w:r>
-          </w:p>
-        </w:tc>
-      </w:tr>
-      <w:tr>
-        <w:tc>
-          <w:tcPr>
-            <w:tcW w:type="dxa" w:w="6240"/>
-            <w:gridSpan w:val="2"/>
-            <w:tcBorders>
-              <w:top w:val="single" w:color="A6C3DC" w:sz="4"/>
-              <w:left w:val="single" w:color="A6C3DC" w:sz="4"/>
-              <w:bottom w:val="single" w:color="A6C3DC" w:sz="4"/>
-              <w:right w:val="single" w:color="A6C3DC" w:sz="4"/>
-            </w:tcBorders>
-            <w:tcMar>
-              <w:top w:type="dxa" w:w="90"/>
-              <w:left w:type="dxa" w:w="140"/>
-              <w:bottom w:type="dxa" w:w="90"/>
-              <w:right w:type="dxa" w:w="140"/>
-            </w:tcMar>
-            <w:vAlign w:val="top"/>
-          </w:tcPr>
-          <w:p>
-            <w:pPr>
-              <w:spacing w:after="40" w:before="0"/>
-            </w:pPr>
-            <w:r>
-              <w:rPr>
-                <w:rFonts w:ascii="Arial" w:cs="Arial" w:eastAsia="Arial" w:hAnsi="Arial"/>
-                <w:b/>
-                <w:bCs/>
-                <w:sz w:val="20"/>
-                <w:szCs w:val="20"/>
-              </w:rPr>
-              <w:t xml:space="preserve">Shift posture</w:t>
-            </w:r>
-          </w:p>
-          <w:p>
-            <w:pPr>
-              <w:spacing w:after="40" w:before="0"/>
-            </w:pPr>
-            <w:r>
-              <w:rPr>
-                <w:rFonts w:ascii="Arial" w:cs="Arial" w:eastAsia="Arial" w:hAnsi="Arial"/>
-                <w:sz w:val="20"/>
-                <w:szCs w:val="20"/>
-              </w:rPr>
-              <w:t xml:space="preserve"/>
-            </w:r>
-          </w:p>
-          <w:p>
-            <w:pPr>
-              <w:spacing w:after="40" w:before="0"/>
-            </w:pPr>
-            <w:r>
-              <w:rPr>
-                <w:rFonts w:ascii="Arial" w:cs="Arial" w:eastAsia="Arial" w:hAnsi="Arial"/>
-                <w:sz w:val="20"/>
-                <w:szCs w:val="20"/>
-              </w:rPr>
-              <w:t xml:space="preserve">______________________</w:t>
-            </w:r>
-          </w:p>
-        </w:tc>
-        <w:tc>
-          <w:tcPr>
-            <w:tcW w:type="dxa" w:w="3120"/>
-            <w:tcBorders>
-              <w:top w:val="single" w:color="A6C3DC" w:sz="4"/>
-              <w:left w:val="single" w:color="A6C3DC" w:sz="4"/>
-              <w:bottom w:val="single" w:color="A6C3DC" w:sz="4"/>
-              <w:right w:val="single" w:color="A6C3DC" w:sz="4"/>
-            </w:tcBorders>
-            <w:tcMar>
-              <w:top w:type="dxa" w:w="90"/>
-              <w:left w:type="dxa" w:w="140"/>
-              <w:bottom w:type="dxa" w:w="90"/>
-              <w:right w:type="dxa" w:w="140"/>
-            </w:tcMar>
-            <w:vAlign w:val="top"/>
-          </w:tcPr>
-          <w:p>
-            <w:pPr>
-              <w:spacing w:after="40" w:before="0"/>
-            </w:pPr>
-            <w:r>
-              <w:rPr>
-                <w:rFonts w:ascii="Arial" w:cs="Arial" w:eastAsia="Arial" w:hAnsi="Arial"/>
-                <w:b/>
-                <w:bCs/>
-                <w:sz w:val="20"/>
-                <w:szCs w:val="20"/>
-              </w:rPr>
-              <w:t xml:space="preserve">Wing CC initials</w:t>
             </w:r>
           </w:p>
           <w:p>
@@ -8870,7 +8533,7 @@
                 <w:sz w:val="20"/>
                 <w:szCs w:val="20"/>
               </w:rPr>
-              <w:t xml:space="preserve">Operation Island Spoke  |  Keep this sheet with the wing</w:t>
+              <w:t xml:space="preserve">Operation Island Spoke</w:t>
             </w:r>
           </w:p>
         </w:tc>
@@ -8895,6 +8558,15 @@
           <w:szCs w:val="24"/>
         </w:rPr>
         <w:t xml:space="preserve">1. Availability Board</w:t>
+      </w:r>
+      <w:r>
+        <w:rPr>
+          <w:rFonts w:ascii="Arial" w:cs="Arial" w:eastAsia="Arial" w:hAnsi="Arial"/>
+          <w:color w:val="666666"/>
+          <w:sz w:val="18"/>
+          <w:szCs w:val="18"/>
+        </w:rPr>
+        <w:t xml:space="preserve">   Fill Ready, Down, and Out from the last readout</w:t>
       </w:r>
     </w:p>
     <w:tbl>
@@ -11440,127 +11112,6 @@
                 <w:szCs w:val="20"/>
               </w:rPr>
               <w:t xml:space="preserve">Total</w:t>
-            </w:r>
-          </w:p>
-          <w:p>
-            <w:pPr>
-              <w:spacing w:after="40" w:before="0"/>
-            </w:pPr>
-            <w:r>
-              <w:rPr>
-                <w:rFonts w:ascii="Arial" w:cs="Arial" w:eastAsia="Arial" w:hAnsi="Arial"/>
-                <w:sz w:val="20"/>
-                <w:szCs w:val="20"/>
-              </w:rPr>
-              <w:t xml:space="preserve"/>
-            </w:r>
-          </w:p>
-          <w:p>
-            <w:pPr>
-              <w:spacing w:after="40" w:before="0"/>
-            </w:pPr>
-            <w:r>
-              <w:rPr>
-                <w:rFonts w:ascii="Arial" w:cs="Arial" w:eastAsia="Arial" w:hAnsi="Arial"/>
-                <w:sz w:val="20"/>
-                <w:szCs w:val="20"/>
-              </w:rPr>
-              <w:t xml:space="preserve">______</w:t>
-            </w:r>
-          </w:p>
-        </w:tc>
-      </w:tr>
-      <w:tr>
-        <w:tc>
-          <w:tcPr>
-            <w:tcW w:type="dxa" w:w="6240"/>
-            <w:gridSpan w:val="2"/>
-            <w:tcBorders>
-              <w:top w:val="single" w:color="A6C3DC" w:sz="4"/>
-              <w:left w:val="single" w:color="A6C3DC" w:sz="4"/>
-              <w:bottom w:val="single" w:color="A6C3DC" w:sz="4"/>
-              <w:right w:val="single" w:color="A6C3DC" w:sz="4"/>
-            </w:tcBorders>
-            <w:tcMar>
-              <w:top w:type="dxa" w:w="90"/>
-              <w:left w:type="dxa" w:w="140"/>
-              <w:bottom w:type="dxa" w:w="90"/>
-              <w:right w:type="dxa" w:w="140"/>
-            </w:tcMar>
-            <w:vAlign w:val="top"/>
-          </w:tcPr>
-          <w:p>
-            <w:pPr>
-              <w:spacing w:after="40" w:before="0"/>
-            </w:pPr>
-            <w:r>
-              <w:rPr>
-                <w:rFonts w:ascii="Arial" w:cs="Arial" w:eastAsia="Arial" w:hAnsi="Arial"/>
-                <w:b/>
-                <w:bCs/>
-                <w:sz w:val="20"/>
-                <w:szCs w:val="20"/>
-              </w:rPr>
-              <w:t xml:space="preserve">Shift posture</w:t>
-            </w:r>
-          </w:p>
-          <w:p>
-            <w:pPr>
-              <w:spacing w:after="40" w:before="0"/>
-            </w:pPr>
-            <w:r>
-              <w:rPr>
-                <w:rFonts w:ascii="Arial" w:cs="Arial" w:eastAsia="Arial" w:hAnsi="Arial"/>
-                <w:sz w:val="20"/>
-                <w:szCs w:val="20"/>
-              </w:rPr>
-              <w:t xml:space="preserve"/>
-            </w:r>
-          </w:p>
-          <w:p>
-            <w:pPr>
-              <w:spacing w:after="40" w:before="0"/>
-            </w:pPr>
-            <w:r>
-              <w:rPr>
-                <w:rFonts w:ascii="Arial" w:cs="Arial" w:eastAsia="Arial" w:hAnsi="Arial"/>
-                <w:sz w:val="20"/>
-                <w:szCs w:val="20"/>
-              </w:rPr>
-              <w:t xml:space="preserve">______________________</w:t>
-            </w:r>
-          </w:p>
-        </w:tc>
-        <w:tc>
-          <w:tcPr>
-            <w:tcW w:type="dxa" w:w="3120"/>
-            <w:tcBorders>
-              <w:top w:val="single" w:color="A6C3DC" w:sz="4"/>
-              <w:left w:val="single" w:color="A6C3DC" w:sz="4"/>
-              <w:bottom w:val="single" w:color="A6C3DC" w:sz="4"/>
-              <w:right w:val="single" w:color="A6C3DC" w:sz="4"/>
-            </w:tcBorders>
-            <w:tcMar>
-              <w:top w:type="dxa" w:w="90"/>
-              <w:left w:type="dxa" w:w="140"/>
-              <w:bottom w:type="dxa" w:w="90"/>
-              <w:right w:type="dxa" w:w="140"/>
-            </w:tcMar>
-            <w:vAlign w:val="top"/>
-          </w:tcPr>
-          <w:p>
-            <w:pPr>
-              <w:spacing w:after="40" w:before="0"/>
-            </w:pPr>
-            <w:r>
-              <w:rPr>
-                <w:rFonts w:ascii="Arial" w:cs="Arial" w:eastAsia="Arial" w:hAnsi="Arial"/>
-                <w:b/>
-                <w:bCs/>
-                <w:sz w:val="20"/>
-                <w:szCs w:val="20"/>
-              </w:rPr>
-              <w:t xml:space="preserve">Wing CC initials</w:t>
             </w:r>
           </w:p>
           <w:p>

</xml_diff>